<commit_message>
feat: complete M2 rule system
</commit_message>
<xml_diff>
--- a/02_Document/20260803.docx
+++ b/02_Document/20260803.docx
@@ -1,11 +1,10 @@
 
 <file path=word/document.xml><?xml version="1.0" encoding="utf-8"?>
-<w:document xmlns:wpc="http://schemas.microsoft.com/office/word/2010/wordprocessingCanvas" xmlns:cx="http://schemas.microsoft.com/office/drawing/2014/chartex" xmlns:cx1="http://schemas.microsoft.com/office/drawing/2015/9/8/chartex" xmlns:cx2="http://schemas.microsoft.com/office/drawing/2015/10/21/chartex" xmlns:cx3="http://schemas.microsoft.com/office/drawing/2016/5/9/chartex" xmlns:cx4="http://schemas.microsoft.com/office/drawing/2016/5/10/chartex" xmlns:cx5="http://schemas.microsoft.com/office/drawing/2016/5/11/chartex" xmlns:cx6="http://schemas.microsoft.com/office/drawing/2016/5/12/chartex" xmlns:cx7="http://schemas.microsoft.com/office/drawing/2016/5/13/chartex" xmlns:cx8="http://schemas.microsoft.com/office/drawing/2016/5/14/chartex" xmlns:mc="http://schemas.openxmlformats.org/markup-compatibility/2006" xmlns:aink="http://schemas.microsoft.com/office/drawing/2016/ink" xmlns:am3d="http://schemas.microsoft.com/office/drawing/2017/model3d" xmlns:o="urn:schemas-microsoft-com:office:office" xmlns:oel="http://schemas.microsoft.com/office/2019/extlst" xmlns:r="http://schemas.openxmlformats.org/officeDocument/2006/relationships" xmlns:m="http://schemas.openxmlformats.org/officeDocument/2006/math" xmlns:v="urn:schemas-microsoft-com:vml" xmlns:wp14="http://schemas.microsoft.com/office/word/2010/wordprocessingDrawing" xmlns:wp="http://schemas.openxmlformats.org/drawingml/2006/wordprocessingDrawing" xmlns:w10="urn:schemas-microsoft-com:office:word" xmlns:w="http://schemas.openxmlformats.org/wordprocessingml/2006/main" xmlns:w14="http://schemas.microsoft.com/office/word/2010/wordml" xmlns:w15="http://schemas.microsoft.com/office/word/2012/wordml" xmlns:w16cex="http://schemas.microsoft.com/office/word/2018/wordml/cex" xmlns:w16cid="http://schemas.microsoft.com/office/word/2016/wordml/cid" xmlns:w16="http://schemas.microsoft.com/office/word/2018/wordml" xmlns:w16sdtdh="http://schemas.microsoft.com/office/word/2020/wordml/sdtdatahash" xmlns:w16se="http://schemas.microsoft.com/office/word/2015/wordml/symex" xmlns:wpg="http://schemas.microsoft.com/office/word/2010/wordprocessingGroup" xmlns:wpi="http://schemas.microsoft.com/office/word/2010/wordprocessingInk" xmlns:wne="http://schemas.microsoft.com/office/word/2006/wordml" xmlns:wps="http://schemas.microsoft.com/office/word/2010/wordprocessingShape" mc:Ignorable="w14 w15 w16se w16cid w16 w16cex w16sdtdh wp14">
+<w:document xmlns:wpc="http://schemas.microsoft.com/office/word/2010/wordprocessingCanvas" xmlns:cx="http://schemas.microsoft.com/office/drawing/2014/chartex" xmlns:cx1="http://schemas.microsoft.com/office/drawing/2015/9/8/chartex" xmlns:cx2="http://schemas.microsoft.com/office/drawing/2015/10/21/chartex" xmlns:cx3="http://schemas.microsoft.com/office/drawing/2016/5/9/chartex" xmlns:cx4="http://schemas.microsoft.com/office/drawing/2016/5/10/chartex" xmlns:cx5="http://schemas.microsoft.com/office/drawing/2016/5/11/chartex" xmlns:cx6="http://schemas.microsoft.com/office/drawing/2016/5/12/chartex" xmlns:cx7="http://schemas.microsoft.com/office/drawing/2016/5/13/chartex" xmlns:cx8="http://schemas.microsoft.com/office/drawing/2016/5/14/chartex" xmlns:mc="http://schemas.openxmlformats.org/markup-compatibility/2006" xmlns:aink="http://schemas.microsoft.com/office/drawing/2016/ink" xmlns:am3d="http://schemas.microsoft.com/office/drawing/2017/model3d" xmlns:o="urn:schemas-microsoft-com:office:office" xmlns:r="http://schemas.openxmlformats.org/officeDocument/2006/relationships" xmlns:m="http://schemas.openxmlformats.org/officeDocument/2006/math" xmlns:v="urn:schemas-microsoft-com:vml" xmlns:wp14="http://schemas.microsoft.com/office/word/2010/wordprocessingDrawing" xmlns:wp="http://schemas.openxmlformats.org/drawingml/2006/wordprocessingDrawing" xmlns:w10="urn:schemas-microsoft-com:office:word" xmlns:w="http://schemas.openxmlformats.org/wordprocessingml/2006/main" xmlns:w14="http://schemas.microsoft.com/office/word/2010/wordml" xmlns:w15="http://schemas.microsoft.com/office/word/2012/wordml" xmlns:w16cex="http://schemas.microsoft.com/office/word/2018/wordml/cex" xmlns:w16cid="http://schemas.microsoft.com/office/word/2016/wordml/cid" xmlns:w16="http://schemas.microsoft.com/office/word/2018/wordml" xmlns:w16sdtdh="http://schemas.microsoft.com/office/word/2020/wordml/sdtdatahash" xmlns:w16se="http://schemas.microsoft.com/office/word/2015/wordml/symex" xmlns:wpg="http://schemas.microsoft.com/office/word/2010/wordprocessingGroup" xmlns:wpi="http://schemas.microsoft.com/office/word/2010/wordprocessingInk" xmlns:wne="http://schemas.microsoft.com/office/word/2006/wordml" xmlns:wps="http://schemas.microsoft.com/office/word/2010/wordprocessingShape" mc:Ignorable="w14 w15 w16se w16cid w16 w16cex w16sdtdh wp14">
   <w:body>
     <w:p>
       <w:pPr>
         <w:rPr>
-          <w:rFonts w:hint="eastAsia"/>
           <w:b/>
           <w:bCs/>
         </w:rPr>
@@ -22,7 +21,6 @@
     <w:p>
       <w:pPr>
         <w:rPr>
-          <w:rFonts w:hint="eastAsia"/>
           <w:b/>
           <w:bCs/>
         </w:rPr>
@@ -41,9 +39,6 @@
           <w:ilvl w:val="0"/>
           <w:numId w:val="1"/>
         </w:numPr>
-        <w:rPr>
-          <w:rFonts w:hint="eastAsia"/>
-        </w:rPr>
       </w:pPr>
       <w:r>
         <w:t>状态：已确认</w:t>
@@ -55,9 +50,6 @@
           <w:ilvl w:val="0"/>
           <w:numId w:val="1"/>
         </w:numPr>
-        <w:rPr>
-          <w:rFonts w:hint="eastAsia"/>
-        </w:rPr>
       </w:pPr>
       <w:r>
         <w:t>适用版本：v0.1.0 起</w:t>
@@ -69,9 +61,6 @@
           <w:ilvl w:val="0"/>
           <w:numId w:val="1"/>
         </w:numPr>
-        <w:rPr>
-          <w:rFonts w:hint="eastAsia"/>
-        </w:rPr>
       </w:pPr>
       <w:r>
         <w:t>需求：应用图标采用一张原创或合法授权的</w:t>
@@ -91,9 +80,6 @@
           <w:ilvl w:val="0"/>
           <w:numId w:val="1"/>
         </w:numPr>
-        <w:rPr>
-          <w:rFonts w:hint="eastAsia"/>
-        </w:rPr>
       </w:pPr>
       <w:r>
         <w:t>验收：</w:t>
@@ -105,9 +91,6 @@
           <w:ilvl w:val="1"/>
           <w:numId w:val="1"/>
         </w:numPr>
-        <w:rPr>
-          <w:rFonts w:hint="eastAsia"/>
-        </w:rPr>
       </w:pPr>
       <w:r>
         <w:t>用于网页图标、PWA 图标和默认分享标识。</w:t>
@@ -119,9 +102,6 @@
           <w:ilvl w:val="1"/>
           <w:numId w:val="1"/>
         </w:numPr>
-        <w:rPr>
-          <w:rFonts w:hint="eastAsia"/>
-        </w:rPr>
       </w:pPr>
       <w:r>
         <w:t>小尺寸下清晰可辨。</w:t>
@@ -133,27 +113,13 @@
           <w:ilvl w:val="1"/>
           <w:numId w:val="1"/>
         </w:numPr>
-        <w:rPr>
-          <w:rFonts w:hint="eastAsia"/>
-        </w:rPr>
       </w:pPr>
       <w:r>
         <w:t>不直接复制现成商用素材。</w:t>
       </w:r>
     </w:p>
-    <w:p>
-      <w:pPr>
-        <w:rPr>
-          <w:rFonts w:hint="eastAsia"/>
-        </w:rPr>
-      </w:pPr>
-    </w:p>
-    <w:p>
-      <w:pPr>
-        <w:rPr>
-          <w:rFonts w:hint="eastAsia"/>
-        </w:rPr>
-      </w:pPr>
+    <w:p/>
+    <w:p>
       <w:r>
         <w:rPr>
           <w:rFonts w:hint="eastAsia"/>
@@ -161,19 +127,8 @@
         <w:t>### REQ-UI-002 麻将牌清晰度优先</w:t>
       </w:r>
     </w:p>
-    <w:p>
-      <w:pPr>
-        <w:rPr>
-          <w:rFonts w:hint="eastAsia"/>
-        </w:rPr>
-      </w:pPr>
-    </w:p>
-    <w:p>
-      <w:pPr>
-        <w:rPr>
-          <w:rFonts w:hint="eastAsia"/>
-        </w:rPr>
-      </w:pPr>
+    <w:p/>
+    <w:p>
       <w:r>
         <w:rPr>
           <w:rFonts w:hint="eastAsia"/>
@@ -182,11 +137,6 @@
       </w:r>
     </w:p>
     <w:p>
-      <w:pPr>
-        <w:rPr>
-          <w:rFonts w:hint="eastAsia"/>
-        </w:rPr>
-      </w:pPr>
       <w:r>
         <w:rPr>
           <w:rFonts w:hint="eastAsia"/>
@@ -195,11 +145,6 @@
       </w:r>
     </w:p>
     <w:p>
-      <w:pPr>
-        <w:rPr>
-          <w:rFonts w:hint="eastAsia"/>
-        </w:rPr>
-      </w:pPr>
       <w:r>
         <w:rPr>
           <w:rFonts w:hint="eastAsia"/>
@@ -222,11 +167,6 @@
       </w:r>
     </w:p>
     <w:p>
-      <w:pPr>
-        <w:rPr>
-          <w:rFonts w:hint="eastAsia"/>
-        </w:rPr>
-      </w:pPr>
       <w:r>
         <w:rPr>
           <w:rFonts w:hint="eastAsia"/>
@@ -235,11 +175,6 @@
       </w:r>
     </w:p>
     <w:p>
-      <w:pPr>
-        <w:rPr>
-          <w:rFonts w:hint="eastAsia"/>
-        </w:rPr>
-      </w:pPr>
       <w:r>
         <w:rPr>
           <w:rFonts w:hint="eastAsia"/>
@@ -290,11 +225,6 @@
       </w:r>
     </w:p>
     <w:p>
-      <w:pPr>
-        <w:rPr>
-          <w:rFonts w:hint="eastAsia"/>
-        </w:rPr>
-      </w:pPr>
       <w:r>
         <w:rPr>
           <w:rFonts w:hint="eastAsia"/>
@@ -330,75 +260,16 @@
         <w:t>牌面。</w:t>
       </w:r>
     </w:p>
-    <w:p>
-      <w:pPr>
-        <w:rPr>
-          <w:rFonts w:hint="eastAsia"/>
-        </w:rPr>
-      </w:pPr>
-    </w:p>
-    <w:p>
-      <w:pPr>
-        <w:rPr>
-          <w:rFonts w:hint="eastAsia"/>
-        </w:rPr>
-      </w:pPr>
-    </w:p>
-    <w:p>
-      <w:pPr>
-        <w:rPr>
-          <w:rFonts w:hint="eastAsia"/>
-        </w:rPr>
-      </w:pPr>
-    </w:p>
-    <w:p>
-      <w:pPr>
-        <w:rPr>
-          <w:rFonts w:hint="eastAsia"/>
-        </w:rPr>
-      </w:pPr>
-    </w:p>
-    <w:p>
-      <w:pPr>
-        <w:rPr>
-          <w:rFonts w:hint="eastAsia"/>
-        </w:rPr>
-      </w:pPr>
-    </w:p>
-    <w:p>
-      <w:pPr>
-        <w:rPr>
-          <w:rFonts w:hint="eastAsia"/>
-        </w:rPr>
-      </w:pPr>
-    </w:p>
-    <w:p>
-      <w:pPr>
-        <w:rPr>
-          <w:rFonts w:hint="eastAsia"/>
-        </w:rPr>
-      </w:pPr>
-    </w:p>
-    <w:p>
-      <w:pPr>
-        <w:rPr>
-          <w:rFonts w:hint="eastAsia"/>
-        </w:rPr>
-      </w:pPr>
-    </w:p>
-    <w:p>
-      <w:pPr>
-        <w:rPr>
-          <w:rFonts w:hint="eastAsia"/>
-        </w:rPr>
-      </w:pPr>
-    </w:p>
-    <w:p>
-      <w:pPr>
-        <w:rPr>
-          <w:rFonts w:hint="eastAsia"/>
-        </w:rPr>
-      </w:pPr>
+    <w:p/>
+    <w:p/>
+    <w:p/>
+    <w:p/>
+    <w:p/>
+    <w:p/>
+    <w:p/>
+    <w:p/>
+    <w:p/>
+    <w:p>
       <w:r>
         <w:rPr>
           <w:rFonts w:hint="eastAsia"/>
@@ -408,11 +279,6 @@
       </w:r>
     </w:p>
     <w:p>
-      <w:pPr>
-        <w:rPr>
-          <w:rFonts w:hint="eastAsia"/>
-        </w:rPr>
-      </w:pPr>
       <w:r>
         <w:rPr>
           <w:rFonts w:hint="eastAsia"/>
@@ -434,19 +300,8 @@
         <w:t>展示</w:t>
       </w:r>
     </w:p>
-    <w:p>
-      <w:pPr>
-        <w:rPr>
-          <w:rFonts w:hint="eastAsia"/>
-        </w:rPr>
-      </w:pPr>
-    </w:p>
-    <w:p>
-      <w:pPr>
-        <w:rPr>
-          <w:rFonts w:hint="eastAsia"/>
-        </w:rPr>
-      </w:pPr>
+    <w:p/>
+    <w:p>
       <w:r>
         <w:rPr>
           <w:rFonts w:hint="eastAsia"/>
@@ -455,11 +310,6 @@
       </w:r>
     </w:p>
     <w:p>
-      <w:pPr>
-        <w:rPr>
-          <w:rFonts w:hint="eastAsia"/>
-        </w:rPr>
-      </w:pPr>
       <w:r>
         <w:rPr>
           <w:rFonts w:hint="eastAsia"/>
@@ -468,11 +318,6 @@
       </w:r>
     </w:p>
     <w:p>
-      <w:pPr>
-        <w:rPr>
-          <w:rFonts w:hint="eastAsia"/>
-        </w:rPr>
-      </w:pPr>
       <w:r>
         <w:rPr>
           <w:rFonts w:hint="eastAsia"/>
@@ -495,11 +340,6 @@
       </w:r>
     </w:p>
     <w:p>
-      <w:pPr>
-        <w:rPr>
-          <w:rFonts w:hint="eastAsia"/>
-        </w:rPr>
-      </w:pPr>
       <w:r>
         <w:rPr>
           <w:rFonts w:hint="eastAsia"/>
@@ -508,11 +348,6 @@
       </w:r>
     </w:p>
     <w:p>
-      <w:pPr>
-        <w:rPr>
-          <w:rFonts w:hint="eastAsia"/>
-        </w:rPr>
-      </w:pPr>
       <w:r>
         <w:rPr>
           <w:rFonts w:hint="eastAsia"/>
@@ -535,11 +370,6 @@
       </w:r>
     </w:p>
     <w:p>
-      <w:pPr>
-        <w:rPr>
-          <w:rFonts w:hint="eastAsia"/>
-        </w:rPr>
-      </w:pPr>
       <w:r>
         <w:rPr>
           <w:rFonts w:hint="eastAsia"/>
@@ -548,11 +378,6 @@
       </w:r>
     </w:p>
     <w:p>
-      <w:pPr>
-        <w:rPr>
-          <w:rFonts w:hint="eastAsia"/>
-        </w:rPr>
-      </w:pPr>
       <w:r>
         <w:rPr>
           <w:rFonts w:hint="eastAsia"/>
@@ -560,19 +385,8 @@
         <w:t xml:space="preserve">  - 不适用牌类直接隐藏并简要说明。</w:t>
       </w:r>
     </w:p>
-    <w:p>
-      <w:pPr>
-        <w:rPr>
-          <w:rFonts w:hint="eastAsia"/>
-        </w:rPr>
-      </w:pPr>
-    </w:p>
-    <w:p>
-      <w:pPr>
-        <w:rPr>
-          <w:rFonts w:hint="eastAsia"/>
-        </w:rPr>
-      </w:pPr>
+    <w:p/>
+    <w:p>
       <w:r>
         <w:rPr>
           <w:rFonts w:hint="eastAsia"/>
@@ -594,17 +408,10 @@
         <w:t>可能就也没有花也没有字牌了，可能就27张牌了</w:t>
       </w:r>
     </w:p>
-    <w:p>
-      <w:pPr>
-        <w:rPr>
-          <w:rFonts w:hint="eastAsia"/>
-        </w:rPr>
-      </w:pPr>
-    </w:p>
-    <w:p>
-      <w:pPr>
-        <w:rPr>
-          <w:rFonts w:hint="eastAsia"/>
+    <w:p/>
+    <w:p>
+      <w:pPr>
+        <w:rPr>
           <w:b/>
           <w:bCs/>
         </w:rPr>
@@ -623,9 +430,6 @@
           <w:ilvl w:val="0"/>
           <w:numId w:val="2"/>
         </w:numPr>
-        <w:rPr>
-          <w:rFonts w:hint="eastAsia"/>
-        </w:rPr>
       </w:pPr>
       <w:r>
         <w:t>状态：已确认</w:t>
@@ -637,9 +441,6 @@
           <w:ilvl w:val="0"/>
           <w:numId w:val="2"/>
         </w:numPr>
-        <w:rPr>
-          <w:rFonts w:hint="eastAsia"/>
-        </w:rPr>
       </w:pPr>
       <w:r>
         <w:t>适用版本：v0.1.0</w:t>
@@ -651,9 +452,6 @@
           <w:ilvl w:val="0"/>
           <w:numId w:val="2"/>
         </w:numPr>
-        <w:rPr>
-          <w:rFonts w:hint="eastAsia"/>
-        </w:rPr>
       </w:pPr>
       <w:r>
         <w:t>需求：支持手牌、吃牌、碰牌、明杠、暗杠、花牌和</w:t>
@@ -673,9 +471,6 @@
           <w:ilvl w:val="0"/>
           <w:numId w:val="2"/>
         </w:numPr>
-        <w:rPr>
-          <w:rFonts w:hint="eastAsia"/>
-        </w:rPr>
       </w:pPr>
       <w:r>
         <w:t>验收：</w:t>
@@ -687,20 +482,12 @@
           <w:ilvl w:val="1"/>
           <w:numId w:val="2"/>
         </w:numPr>
-        <w:rPr>
-          <w:rFonts w:hint="eastAsia"/>
-        </w:rPr>
       </w:pPr>
       <w:r>
         <w:t>用户先选择活动区域，再点击选牌器。</w:t>
       </w:r>
     </w:p>
     <w:p>
-      <w:pPr>
-        <w:rPr>
-          <w:rFonts w:hint="eastAsia"/>
-        </w:rPr>
-      </w:pPr>
       <w:r>
         <w:rPr>
           <w:rFonts w:hint="eastAsia"/>
@@ -765,34 +552,10 @@
         <w:t>可以有固定的独立区域</w:t>
       </w:r>
     </w:p>
-    <w:p>
-      <w:pPr>
-        <w:rPr>
-          <w:rFonts w:hint="eastAsia"/>
-        </w:rPr>
-      </w:pPr>
-    </w:p>
-    <w:p>
-      <w:pPr>
-        <w:rPr>
-          <w:rFonts w:hint="eastAsia"/>
-        </w:rPr>
-      </w:pPr>
-    </w:p>
-    <w:p>
-      <w:pPr>
-        <w:rPr>
-          <w:rFonts w:hint="eastAsia"/>
-        </w:rPr>
-      </w:pPr>
-    </w:p>
-    <w:p>
-      <w:pPr>
-        <w:rPr>
-          <w:rFonts w:hint="eastAsia"/>
-        </w:rPr>
-      </w:pPr>
-    </w:p>
+    <w:p/>
+    <w:p/>
+    <w:p/>
+    <w:p/>
     <w:p>
       <w:proofErr w:type="gramStart"/>
       <w:r>
@@ -920,41 +683,118 @@
         <w:t>每完成一份，先由你审阅确认，再生成下一份。这样虽然耗时更长，但最能保证完整性和一致性，也能避免后面的架构与任务建立在错误需求上。</w:t>
       </w:r>
     </w:p>
-    <w:p>
-      <w:pPr>
-        <w:rPr>
-          <w:rFonts w:hint="eastAsia"/>
-        </w:rPr>
-      </w:pPr>
-    </w:p>
-    <w:p>
-      <w:pPr>
-        <w:rPr>
-          <w:rFonts w:hint="eastAsia"/>
-        </w:rPr>
-      </w:pPr>
-    </w:p>
-    <w:p>
-      <w:pPr>
-        <w:rPr>
-          <w:rFonts w:hint="eastAsia"/>
-        </w:rPr>
-      </w:pPr>
-    </w:p>
-    <w:p>
-      <w:pPr>
-        <w:rPr>
-          <w:rFonts w:hint="eastAsia"/>
-        </w:rPr>
-      </w:pPr>
-    </w:p>
-    <w:p>
-      <w:pPr>
-        <w:rPr>
-          <w:rFonts w:hint="eastAsia"/>
-        </w:rPr>
-      </w:pPr>
-    </w:p>
+    <w:p/>
+    <w:p/>
+    <w:p>
+      <w:pPr>
+        <w:widowControl/>
+        <w:spacing w:after="0" w:line="240" w:lineRule="auto"/>
+        <w:rPr>
+          <w:rFonts w:ascii="宋体" w:eastAsia="宋体" w:hAnsi="宋体" w:cs="宋体"/>
+          <w:kern w:val="0"/>
+          <w:sz w:val="24"/>
+          <w14:ligatures w14:val="none"/>
+        </w:rPr>
+      </w:pPr>
+      <w:r>
+        <w:rPr>
+          <w:rFonts w:ascii="宋体" w:eastAsia="宋体" w:hAnsi="宋体" w:cs="宋体"/>
+          <w:kern w:val="0"/>
+          <w:sz w:val="24"/>
+          <w14:ligatures w14:val="none"/>
+        </w:rPr>
+        <w:t>一共多少个batch?请简要回答</w:t>
+      </w:r>
+    </w:p>
+    <w:p>
+      <w:pPr>
+        <w:widowControl/>
+        <w:spacing w:before="100" w:beforeAutospacing="1" w:after="100" w:afterAutospacing="1" w:line="240" w:lineRule="auto"/>
+        <w:rPr>
+          <w:rFonts w:ascii="宋体" w:eastAsia="宋体" w:hAnsi="宋体" w:cs="宋体"/>
+          <w:kern w:val="0"/>
+          <w:sz w:val="24"/>
+          <w14:ligatures w14:val="none"/>
+        </w:rPr>
+      </w:pPr>
+      <w:r>
+        <w:rPr>
+          <w:rFonts w:ascii="宋体" w:eastAsia="宋体" w:hAnsi="宋体" w:cs="宋体"/>
+          <w:kern w:val="0"/>
+          <w:sz w:val="24"/>
+          <w14:ligatures w14:val="none"/>
+        </w:rPr>
+        <w:t xml:space="preserve">按当前 tasks.md 的批次结构，一共 </w:t>
+      </w:r>
+      <w:r>
+        <w:rPr>
+          <w:rFonts w:ascii="宋体" w:eastAsia="宋体" w:hAnsi="宋体" w:cs="宋体"/>
+          <w:b/>
+          <w:bCs/>
+          <w:kern w:val="0"/>
+          <w:sz w:val="24"/>
+          <w14:ligatures w14:val="none"/>
+        </w:rPr>
+        <w:t xml:space="preserve">38 </w:t>
+      </w:r>
+      <w:proofErr w:type="gramStart"/>
+      <w:r>
+        <w:rPr>
+          <w:rFonts w:ascii="宋体" w:eastAsia="宋体" w:hAnsi="宋体" w:cs="宋体"/>
+          <w:b/>
+          <w:bCs/>
+          <w:kern w:val="0"/>
+          <w:sz w:val="24"/>
+          <w14:ligatures w14:val="none"/>
+        </w:rPr>
+        <w:t>个</w:t>
+      </w:r>
+      <w:proofErr w:type="gramEnd"/>
+      <w:r>
+        <w:rPr>
+          <w:rFonts w:ascii="宋体" w:eastAsia="宋体" w:hAnsi="宋体" w:cs="宋体"/>
+          <w:b/>
+          <w:bCs/>
+          <w:kern w:val="0"/>
+          <w:sz w:val="24"/>
+          <w14:ligatures w14:val="none"/>
+        </w:rPr>
+        <w:t xml:space="preserve"> Batch</w:t>
+      </w:r>
+      <w:r>
+        <w:rPr>
+          <w:rFonts w:ascii="宋体" w:eastAsia="宋体" w:hAnsi="宋体" w:cs="宋体"/>
+          <w:kern w:val="0"/>
+          <w:sz w:val="24"/>
+          <w14:ligatures w14:val="none"/>
+        </w:rPr>
+        <w:t>。</w:t>
+      </w:r>
+    </w:p>
+    <w:p>
+      <w:pPr>
+        <w:widowControl/>
+        <w:spacing w:before="100" w:beforeAutospacing="1" w:after="100" w:afterAutospacing="1" w:line="240" w:lineRule="auto"/>
+        <w:rPr>
+          <w:rFonts w:ascii="宋体" w:eastAsia="宋体" w:hAnsi="宋体" w:cs="宋体"/>
+          <w:kern w:val="0"/>
+          <w:sz w:val="24"/>
+          <w14:ligatures w14:val="none"/>
+        </w:rPr>
+      </w:pPr>
+      <w:r>
+        <w:rPr>
+          <w:rFonts w:ascii="宋体" w:eastAsia="宋体" w:hAnsi="宋体" w:cs="宋体"/>
+          <w:kern w:val="0"/>
+          <w:sz w:val="24"/>
+          <w14:ligatures w14:val="none"/>
+        </w:rPr>
+        <w:t>其中包含普通 Batch 01～29，以及 06A、06B、13A、15A、17A、21A、23A、29A、29B 这些追加批次。</w:t>
+      </w:r>
+    </w:p>
+    <w:p/>
+    <w:p/>
+    <w:p/>
     <w:sectPr>
       <w:pgSz w:w="11906" w:h="16838"/>
       <w:pgMar w:top="1440" w:right="1800" w:bottom="1440" w:left="1800" w:header="851" w:footer="992" w:gutter="0"/>
@@ -966,14 +806,11 @@
 </file>
 
 <file path=word/endnotes.xml><?xml version="1.0" encoding="utf-8"?>
-<w:endnotes xmlns:wpc="http://schemas.microsoft.com/office/word/2010/wordprocessingCanvas" xmlns:cx="http://schemas.microsoft.com/office/drawing/2014/chartex" xmlns:cx1="http://schemas.microsoft.com/office/drawing/2015/9/8/chartex" xmlns:cx2="http://schemas.microsoft.com/office/drawing/2015/10/21/chartex" xmlns:cx3="http://schemas.microsoft.com/office/drawing/2016/5/9/chartex" xmlns:cx4="http://schemas.microsoft.com/office/drawing/2016/5/10/chartex" xmlns:cx5="http://schemas.microsoft.com/office/drawing/2016/5/11/chartex" xmlns:cx6="http://schemas.microsoft.com/office/drawing/2016/5/12/chartex" xmlns:cx7="http://schemas.microsoft.com/office/drawing/2016/5/13/chartex" xmlns:cx8="http://schemas.microsoft.com/office/drawing/2016/5/14/chartex" xmlns:mc="http://schemas.openxmlformats.org/markup-compatibility/2006" xmlns:aink="http://schemas.microsoft.com/office/drawing/2016/ink" xmlns:am3d="http://schemas.microsoft.com/office/drawing/2017/model3d" xmlns:o="urn:schemas-microsoft-com:office:office" xmlns:oel="http://schemas.microsoft.com/office/2019/extlst" xmlns:r="http://schemas.openxmlformats.org/officeDocument/2006/relationships" xmlns:m="http://schemas.openxmlformats.org/officeDocument/2006/math" xmlns:v="urn:schemas-microsoft-com:vml" xmlns:wp14="http://schemas.microsoft.com/office/word/2010/wordprocessingDrawing" xmlns:wp="http://schemas.openxmlformats.org/drawingml/2006/wordprocessingDrawing" xmlns:w10="urn:schemas-microsoft-com:office:word" xmlns:w="http://schemas.openxmlformats.org/wordprocessingml/2006/main" xmlns:w14="http://schemas.microsoft.com/office/word/2010/wordml" xmlns:w15="http://schemas.microsoft.com/office/word/2012/wordml" xmlns:w16cex="http://schemas.microsoft.com/office/word/2018/wordml/cex" xmlns:w16cid="http://schemas.microsoft.com/office/word/2016/wordml/cid" xmlns:w16="http://schemas.microsoft.com/office/word/2018/wordml" xmlns:w16sdtdh="http://schemas.microsoft.com/office/word/2020/wordml/sdtdatahash" xmlns:w16se="http://schemas.microsoft.com/office/word/2015/wordml/symex" xmlns:wpg="http://schemas.microsoft.com/office/word/2010/wordprocessingGroup" xmlns:wpi="http://schemas.microsoft.com/office/word/2010/wordprocessingInk" xmlns:wne="http://schemas.microsoft.com/office/word/2006/wordml" xmlns:wps="http://schemas.microsoft.com/office/word/2010/wordprocessingShape" mc:Ignorable="w14 w15 w16se w16cid w16 w16cex w16sdtdh wp14">
+<w:endnotes xmlns:wpc="http://schemas.microsoft.com/office/word/2010/wordprocessingCanvas" xmlns:cx="http://schemas.microsoft.com/office/drawing/2014/chartex" xmlns:cx1="http://schemas.microsoft.com/office/drawing/2015/9/8/chartex" xmlns:cx2="http://schemas.microsoft.com/office/drawing/2015/10/21/chartex" xmlns:cx3="http://schemas.microsoft.com/office/drawing/2016/5/9/chartex" xmlns:cx4="http://schemas.microsoft.com/office/drawing/2016/5/10/chartex" xmlns:cx5="http://schemas.microsoft.com/office/drawing/2016/5/11/chartex" xmlns:cx6="http://schemas.microsoft.com/office/drawing/2016/5/12/chartex" xmlns:cx7="http://schemas.microsoft.com/office/drawing/2016/5/13/chartex" xmlns:cx8="http://schemas.microsoft.com/office/drawing/2016/5/14/chartex" xmlns:mc="http://schemas.openxmlformats.org/markup-compatibility/2006" xmlns:aink="http://schemas.microsoft.com/office/drawing/2016/ink" xmlns:am3d="http://schemas.microsoft.com/office/drawing/2017/model3d" xmlns:o="urn:schemas-microsoft-com:office:office" xmlns:r="http://schemas.openxmlformats.org/officeDocument/2006/relationships" xmlns:m="http://schemas.openxmlformats.org/officeDocument/2006/math" xmlns:v="urn:schemas-microsoft-com:vml" xmlns:wp14="http://schemas.microsoft.com/office/word/2010/wordprocessingDrawing" xmlns:wp="http://schemas.openxmlformats.org/drawingml/2006/wordprocessingDrawing" xmlns:w10="urn:schemas-microsoft-com:office:word" xmlns:w="http://schemas.openxmlformats.org/wordprocessingml/2006/main" xmlns:w14="http://schemas.microsoft.com/office/word/2010/wordml" xmlns:w15="http://schemas.microsoft.com/office/word/2012/wordml" xmlns:w16cex="http://schemas.microsoft.com/office/word/2018/wordml/cex" xmlns:w16cid="http://schemas.microsoft.com/office/word/2016/wordml/cid" xmlns:w16="http://schemas.microsoft.com/office/word/2018/wordml" xmlns:w16sdtdh="http://schemas.microsoft.com/office/word/2020/wordml/sdtdatahash" xmlns:w16se="http://schemas.microsoft.com/office/word/2015/wordml/symex" xmlns:wpg="http://schemas.microsoft.com/office/word/2010/wordprocessingGroup" xmlns:wpi="http://schemas.microsoft.com/office/word/2010/wordprocessingInk" xmlns:wne="http://schemas.microsoft.com/office/word/2006/wordml" xmlns:wps="http://schemas.microsoft.com/office/word/2010/wordprocessingShape" mc:Ignorable="w14 w15 w16se w16cid w16 w16cex w16sdtdh wp14">
   <w:endnote w:type="separator" w:id="-1">
     <w:p>
       <w:pPr>
         <w:spacing w:after="0" w:line="240" w:lineRule="auto"/>
-        <w:rPr>
-          <w:rFonts w:hint="eastAsia"/>
-        </w:rPr>
       </w:pPr>
       <w:r>
         <w:separator/>
@@ -984,9 +821,6 @@
     <w:p>
       <w:pPr>
         <w:spacing w:after="0" w:line="240" w:lineRule="auto"/>
-        <w:rPr>
-          <w:rFonts w:hint="eastAsia"/>
-        </w:rPr>
       </w:pPr>
       <w:r>
         <w:continuationSeparator/>
@@ -997,14 +831,11 @@
 </file>
 
 <file path=word/footnotes.xml><?xml version="1.0" encoding="utf-8"?>
-<w:footnotes xmlns:wpc="http://schemas.microsoft.com/office/word/2010/wordprocessingCanvas" xmlns:cx="http://schemas.microsoft.com/office/drawing/2014/chartex" xmlns:cx1="http://schemas.microsoft.com/office/drawing/2015/9/8/chartex" xmlns:cx2="http://schemas.microsoft.com/office/drawing/2015/10/21/chartex" xmlns:cx3="http://schemas.microsoft.com/office/drawing/2016/5/9/chartex" xmlns:cx4="http://schemas.microsoft.com/office/drawing/2016/5/10/chartex" xmlns:cx5="http://schemas.microsoft.com/office/drawing/2016/5/11/chartex" xmlns:cx6="http://schemas.microsoft.com/office/drawing/2016/5/12/chartex" xmlns:cx7="http://schemas.microsoft.com/office/drawing/2016/5/13/chartex" xmlns:cx8="http://schemas.microsoft.com/office/drawing/2016/5/14/chartex" xmlns:mc="http://schemas.openxmlformats.org/markup-compatibility/2006" xmlns:aink="http://schemas.microsoft.com/office/drawing/2016/ink" xmlns:am3d="http://schemas.microsoft.com/office/drawing/2017/model3d" xmlns:o="urn:schemas-microsoft-com:office:office" xmlns:oel="http://schemas.microsoft.com/office/2019/extlst" xmlns:r="http://schemas.openxmlformats.org/officeDocument/2006/relationships" xmlns:m="http://schemas.openxmlformats.org/officeDocument/2006/math" xmlns:v="urn:schemas-microsoft-com:vml" xmlns:wp14="http://schemas.microsoft.com/office/word/2010/wordprocessingDrawing" xmlns:wp="http://schemas.openxmlformats.org/drawingml/2006/wordprocessingDrawing" xmlns:w10="urn:schemas-microsoft-com:office:word" xmlns:w="http://schemas.openxmlformats.org/wordprocessingml/2006/main" xmlns:w14="http://schemas.microsoft.com/office/word/2010/wordml" xmlns:w15="http://schemas.microsoft.com/office/word/2012/wordml" xmlns:w16cex="http://schemas.microsoft.com/office/word/2018/wordml/cex" xmlns:w16cid="http://schemas.microsoft.com/office/word/2016/wordml/cid" xmlns:w16="http://schemas.microsoft.com/office/word/2018/wordml" xmlns:w16sdtdh="http://schemas.microsoft.com/office/word/2020/wordml/sdtdatahash" xmlns:w16se="http://schemas.microsoft.com/office/word/2015/wordml/symex" xmlns:wpg="http://schemas.microsoft.com/office/word/2010/wordprocessingGroup" xmlns:wpi="http://schemas.microsoft.com/office/word/2010/wordprocessingInk" xmlns:wne="http://schemas.microsoft.com/office/word/2006/wordml" xmlns:wps="http://schemas.microsoft.com/office/word/2010/wordprocessingShape" mc:Ignorable="w14 w15 w16se w16cid w16 w16cex w16sdtdh wp14">
+<w:footnotes xmlns:wpc="http://schemas.microsoft.com/office/word/2010/wordprocessingCanvas" xmlns:cx="http://schemas.microsoft.com/office/drawing/2014/chartex" xmlns:cx1="http://schemas.microsoft.com/office/drawing/2015/9/8/chartex" xmlns:cx2="http://schemas.microsoft.com/office/drawing/2015/10/21/chartex" xmlns:cx3="http://schemas.microsoft.com/office/drawing/2016/5/9/chartex" xmlns:cx4="http://schemas.microsoft.com/office/drawing/2016/5/10/chartex" xmlns:cx5="http://schemas.microsoft.com/office/drawing/2016/5/11/chartex" xmlns:cx6="http://schemas.microsoft.com/office/drawing/2016/5/12/chartex" xmlns:cx7="http://schemas.microsoft.com/office/drawing/2016/5/13/chartex" xmlns:cx8="http://schemas.microsoft.com/office/drawing/2016/5/14/chartex" xmlns:mc="http://schemas.openxmlformats.org/markup-compatibility/2006" xmlns:aink="http://schemas.microsoft.com/office/drawing/2016/ink" xmlns:am3d="http://schemas.microsoft.com/office/drawing/2017/model3d" xmlns:o="urn:schemas-microsoft-com:office:office" xmlns:r="http://schemas.openxmlformats.org/officeDocument/2006/relationships" xmlns:m="http://schemas.openxmlformats.org/officeDocument/2006/math" xmlns:v="urn:schemas-microsoft-com:vml" xmlns:wp14="http://schemas.microsoft.com/office/word/2010/wordprocessingDrawing" xmlns:wp="http://schemas.openxmlformats.org/drawingml/2006/wordprocessingDrawing" xmlns:w10="urn:schemas-microsoft-com:office:word" xmlns:w="http://schemas.openxmlformats.org/wordprocessingml/2006/main" xmlns:w14="http://schemas.microsoft.com/office/word/2010/wordml" xmlns:w15="http://schemas.microsoft.com/office/word/2012/wordml" xmlns:w16cex="http://schemas.microsoft.com/office/word/2018/wordml/cex" xmlns:w16cid="http://schemas.microsoft.com/office/word/2016/wordml/cid" xmlns:w16="http://schemas.microsoft.com/office/word/2018/wordml" xmlns:w16sdtdh="http://schemas.microsoft.com/office/word/2020/wordml/sdtdatahash" xmlns:w16se="http://schemas.microsoft.com/office/word/2015/wordml/symex" xmlns:wpg="http://schemas.microsoft.com/office/word/2010/wordprocessingGroup" xmlns:wpi="http://schemas.microsoft.com/office/word/2010/wordprocessingInk" xmlns:wne="http://schemas.microsoft.com/office/word/2006/wordml" xmlns:wps="http://schemas.microsoft.com/office/word/2010/wordprocessingShape" mc:Ignorable="w14 w15 w16se w16cid w16 w16cex w16sdtdh wp14">
   <w:footnote w:type="separator" w:id="-1">
     <w:p>
       <w:pPr>
         <w:spacing w:after="0" w:line="240" w:lineRule="auto"/>
-        <w:rPr>
-          <w:rFonts w:hint="eastAsia"/>
-        </w:rPr>
       </w:pPr>
       <w:r>
         <w:separator/>
@@ -1015,9 +846,6 @@
     <w:p>
       <w:pPr>
         <w:spacing w:after="0" w:line="240" w:lineRule="auto"/>
-        <w:rPr>
-          <w:rFonts w:hint="eastAsia"/>
-        </w:rPr>
       </w:pPr>
       <w:r>
         <w:continuationSeparator/>
@@ -1028,7 +856,7 @@
 </file>
 
 <file path=word/numbering.xml><?xml version="1.0" encoding="utf-8"?>
-<w:numbering xmlns:wpc="http://schemas.microsoft.com/office/word/2010/wordprocessingCanvas" xmlns:cx="http://schemas.microsoft.com/office/drawing/2014/chartex" xmlns:cx1="http://schemas.microsoft.com/office/drawing/2015/9/8/chartex" xmlns:cx2="http://schemas.microsoft.com/office/drawing/2015/10/21/chartex" xmlns:cx3="http://schemas.microsoft.com/office/drawing/2016/5/9/chartex" xmlns:cx4="http://schemas.microsoft.com/office/drawing/2016/5/10/chartex" xmlns:cx5="http://schemas.microsoft.com/office/drawing/2016/5/11/chartex" xmlns:cx6="http://schemas.microsoft.com/office/drawing/2016/5/12/chartex" xmlns:cx7="http://schemas.microsoft.com/office/drawing/2016/5/13/chartex" xmlns:cx8="http://schemas.microsoft.com/office/drawing/2016/5/14/chartex" xmlns:mc="http://schemas.openxmlformats.org/markup-compatibility/2006" xmlns:aink="http://schemas.microsoft.com/office/drawing/2016/ink" xmlns:am3d="http://schemas.microsoft.com/office/drawing/2017/model3d" xmlns:o="urn:schemas-microsoft-com:office:office" xmlns:oel="http://schemas.microsoft.com/office/2019/extlst" xmlns:r="http://schemas.openxmlformats.org/officeDocument/2006/relationships" xmlns:m="http://schemas.openxmlformats.org/officeDocument/2006/math" xmlns:v="urn:schemas-microsoft-com:vml" xmlns:wp14="http://schemas.microsoft.com/office/word/2010/wordprocessingDrawing" xmlns:wp="http://schemas.openxmlformats.org/drawingml/2006/wordprocessingDrawing" xmlns:w10="urn:schemas-microsoft-com:office:word" xmlns:w="http://schemas.openxmlformats.org/wordprocessingml/2006/main" xmlns:w14="http://schemas.microsoft.com/office/word/2010/wordml" xmlns:w15="http://schemas.microsoft.com/office/word/2012/wordml" xmlns:w16cex="http://schemas.microsoft.com/office/word/2018/wordml/cex" xmlns:w16cid="http://schemas.microsoft.com/office/word/2016/wordml/cid" xmlns:w16="http://schemas.microsoft.com/office/word/2018/wordml" xmlns:w16sdtdh="http://schemas.microsoft.com/office/word/2020/wordml/sdtdatahash" xmlns:w16se="http://schemas.microsoft.com/office/word/2015/wordml/symex" xmlns:wpg="http://schemas.microsoft.com/office/word/2010/wordprocessingGroup" xmlns:wpi="http://schemas.microsoft.com/office/word/2010/wordprocessingInk" xmlns:wne="http://schemas.microsoft.com/office/word/2006/wordml" xmlns:wps="http://schemas.microsoft.com/office/word/2010/wordprocessingShape" mc:Ignorable="w14 w15 w16se w16cid w16 w16cex w16sdtdh wp14">
+<w:numbering xmlns:wpc="http://schemas.microsoft.com/office/word/2010/wordprocessingCanvas" xmlns:cx="http://schemas.microsoft.com/office/drawing/2014/chartex" xmlns:cx1="http://schemas.microsoft.com/office/drawing/2015/9/8/chartex" xmlns:cx2="http://schemas.microsoft.com/office/drawing/2015/10/21/chartex" xmlns:cx3="http://schemas.microsoft.com/office/drawing/2016/5/9/chartex" xmlns:cx4="http://schemas.microsoft.com/office/drawing/2016/5/10/chartex" xmlns:cx5="http://schemas.microsoft.com/office/drawing/2016/5/11/chartex" xmlns:cx6="http://schemas.microsoft.com/office/drawing/2016/5/12/chartex" xmlns:cx7="http://schemas.microsoft.com/office/drawing/2016/5/13/chartex" xmlns:cx8="http://schemas.microsoft.com/office/drawing/2016/5/14/chartex" xmlns:mc="http://schemas.openxmlformats.org/markup-compatibility/2006" xmlns:aink="http://schemas.microsoft.com/office/drawing/2016/ink" xmlns:am3d="http://schemas.microsoft.com/office/drawing/2017/model3d" xmlns:o="urn:schemas-microsoft-com:office:office" xmlns:r="http://schemas.openxmlformats.org/officeDocument/2006/relationships" xmlns:m="http://schemas.openxmlformats.org/officeDocument/2006/math" xmlns:v="urn:schemas-microsoft-com:vml" xmlns:wp14="http://schemas.microsoft.com/office/word/2010/wordprocessingDrawing" xmlns:wp="http://schemas.openxmlformats.org/drawingml/2006/wordprocessingDrawing" xmlns:w10="urn:schemas-microsoft-com:office:word" xmlns:w="http://schemas.openxmlformats.org/wordprocessingml/2006/main" xmlns:w14="http://schemas.microsoft.com/office/word/2010/wordml" xmlns:w15="http://schemas.microsoft.com/office/word/2012/wordml" xmlns:w16cex="http://schemas.microsoft.com/office/word/2018/wordml/cex" xmlns:w16cid="http://schemas.microsoft.com/office/word/2016/wordml/cid" xmlns:w16="http://schemas.microsoft.com/office/word/2018/wordml" xmlns:w16sdtdh="http://schemas.microsoft.com/office/word/2020/wordml/sdtdatahash" xmlns:w16se="http://schemas.microsoft.com/office/word/2015/wordml/symex" xmlns:wpg="http://schemas.microsoft.com/office/word/2010/wordprocessingGroup" xmlns:wpi="http://schemas.microsoft.com/office/word/2010/wordprocessingInk" xmlns:wne="http://schemas.microsoft.com/office/word/2006/wordml" xmlns:wps="http://schemas.microsoft.com/office/word/2010/wordprocessingShape" mc:Ignorable="w14 w15 w16se w16cid w16 w16cex w16sdtdh wp14">
   <w:abstractNum w:abstractNumId="0" w15:restartNumberingAfterBreak="0">
     <w:nsid w:val="134162E9"/>
     <w:multiLevelType w:val="multilevel"/>
@@ -1440,13 +1268,13 @@
       </w:pPr>
     </w:lvl>
   </w:abstractNum>
-  <w:num w:numId="1" w16cid:durableId="651981933">
+  <w:num w:numId="1">
     <w:abstractNumId w:val="0"/>
   </w:num>
-  <w:num w:numId="2" w16cid:durableId="2094812350">
+  <w:num w:numId="2">
     <w:abstractNumId w:val="1"/>
   </w:num>
-  <w:num w:numId="3" w16cid:durableId="1400399173">
+  <w:num w:numId="3">
     <w:abstractNumId w:val="2"/>
   </w:num>
 </w:numbering>
@@ -2059,6 +1887,7 @@
   <w:style w:type="character" w:default="1" w:styleId="a0">
     <w:name w:val="Default Paragraph Font"/>
     <w:uiPriority w:val="1"/>
+    <w:semiHidden/>
     <w:unhideWhenUsed/>
   </w:style>
   <w:style w:type="table" w:default="1" w:styleId="a1">
@@ -2436,6 +2265,48 @@
     <w:rPr>
       <w:sz w:val="18"/>
       <w:szCs w:val="18"/>
+    </w:rPr>
+  </w:style>
+  <w:style w:type="paragraph" w:styleId="af2">
+    <w:name w:val="Normal (Web)"/>
+    <w:basedOn w:val="a"/>
+    <w:uiPriority w:val="99"/>
+    <w:semiHidden/>
+    <w:unhideWhenUsed/>
+    <w:rsid w:val="00BD1477"/>
+    <w:pPr>
+      <w:widowControl/>
+      <w:spacing w:before="100" w:beforeAutospacing="1" w:after="100" w:afterAutospacing="1" w:line="240" w:lineRule="auto"/>
+    </w:pPr>
+    <w:rPr>
+      <w:rFonts w:ascii="宋体" w:eastAsia="宋体" w:hAnsi="宋体" w:cs="宋体"/>
+      <w:kern w:val="0"/>
+      <w:sz w:val="24"/>
+      <w14:ligatures w14:val="none"/>
+    </w:rPr>
+  </w:style>
+  <w:style w:type="character" w:styleId="HTML">
+    <w:name w:val="HTML Code"/>
+    <w:basedOn w:val="a0"/>
+    <w:uiPriority w:val="99"/>
+    <w:semiHidden/>
+    <w:unhideWhenUsed/>
+    <w:rsid w:val="00BD1477"/>
+    <w:rPr>
+      <w:rFonts w:ascii="宋体" w:eastAsia="宋体" w:hAnsi="宋体" w:cs="宋体"/>
+      <w:sz w:val="24"/>
+      <w:szCs w:val="24"/>
+    </w:rPr>
+  </w:style>
+  <w:style w:type="character" w:styleId="af3">
+    <w:name w:val="Strong"/>
+    <w:basedOn w:val="a0"/>
+    <w:uiPriority w:val="22"/>
+    <w:qFormat/>
+    <w:rsid w:val="00BD1477"/>
+    <w:rPr>
+      <w:b/>
+      <w:bCs/>
     </w:rPr>
   </w:style>
 </w:styles>

</xml_diff>